<commit_message>
Rebuild the template after the list-section helper
The helper names every list loop variable `line`, so the committed file's
tags differed from a fresh build and test_build caught it, exactly as
ADR-0006 intends.

Co-Authored-By: Claude Opus 5 <noreply@anthropic.com>
Claude-Session: https://claude.ai/code/session_016pH63xup3DLhwEedJo3bHT
</commit_message>
<xml_diff>
--- a/templates/fictitious_recruitment.docx
+++ b/templates/fictitious_recruitment.docx
@@ -58,7 +58,7 @@
     </w:p>
     <w:p>
       <w:r>
-        <w:t>{%p for skill in skills %}</w:t>
+        <w:t>{%p for line in skills %}</w:t>
       </w:r>
     </w:p>
     <w:p>
@@ -66,7 +66,7 @@
         <w:pStyle w:val="ListBullet"/>
       </w:pPr>
       <w:r>
-        <w:t>{{ skill }}</w:t>
+        <w:t>{{ line }}</w:t>
       </w:r>
     </w:p>
     <w:p>

</xml_diff>